<commit_message>
chapitre 2 : correction du style Titre 4 (2.9.2.x)
</commit_message>
<xml_diff>
--- a/memoire/Chapitre_2_PharmaGeno_FINAL.docx
+++ b/memoire/Chapitre_2_PharmaGeno_FINAL.docx
@@ -1545,15 +1545,16 @@
     <w:pPr>
       <w:keepNext w:val="1"/>
       <w:keepLines w:val="1"/>
-      <w:spacing w:after="0" w:before="200" w:lineRule="auto"/>
+      <w:spacing w:before="200" w:lineRule="auto"/>
     </w:pPr>
     <w:rPr>
-      <w:rFonts w:ascii="Calibri" w:cs="Calibri" w:eastAsia="Calibri" w:hAnsi="Calibri"/>
-      <w:b w:val="1"/>
+      <w:rFonts w:ascii="Times New Roman" w:cs="Times New Roman" w:eastAsia="Times New Roman" w:hAnsi="Times New Roman"/>
+      <w:b/>
       <w:bCs w:val="1"/>
       <w:i w:val="1"/>
       <w:iCs w:val="1"/>
-      <w:color w:val="4f81bd"/>
+      <w:color w:val="1F4E79"/>
+      <w:sz w:val="22"/>
     </w:rPr>
   </w:style>
   <w:style w:type="paragraph" w:styleId="Heading5">

</xml_diff>